<commit_message>
delete standard equipment not neccessary
</commit_message>
<xml_diff>
--- a/static/GCN_000009.docx
+++ b/static/GCN_000009.docx
@@ -1199,7 +1199,7 @@
                 <w:sz w:val="18"/>
                 <w:szCs w:val="18"/>
               </w:rPr>
-              <w:t xml:space="preserve">LAB-CALIPER.01</w:t>
+              <w:t xml:space="preserve">LAB-BALANCE.01</w:t>
             </w:r>
           </w:p>
         </w:tc>
@@ -1397,7 +1397,403 @@
                 <w:sz w:val="18"/>
                 <w:szCs w:val="18"/>
               </w:rPr>
-              <w:t xml:space="preserve">LAB-GBLOCK.01</w:t>
+              <w:t xml:space="preserve">LAB-BALANCE.01</w:t>
+            </w:r>
+          </w:p>
+        </w:tc>
+      </w:tr>
+      <w:tr>
+        <w:tc>
+          <w:tcPr>
+            <w:tcBorders>
+              <w:top w:val="single" w:color="b8b5ae" w:sz="1"/>
+              <w:left w:val="single" w:color="b8b5ae" w:sz="1"/>
+              <w:bottom w:val="single" w:color="b8b5ae" w:sz="1"/>
+              <w:right w:val="single" w:color="b8b5ae" w:sz="1"/>
+            </w:tcBorders>
+            <w:vAlign w:val="center"/>
+          </w:tcPr>
+          <w:p>
+            <w:pPr>
+              <w:spacing w:after="40" w:before="40"/>
+              <w:jc w:val="left"/>
+            </w:pPr>
+            <w:r>
+              <w:rPr>
+                <w:rFonts w:ascii="Arial" w:cs="Arial" w:eastAsia="Arial" w:hAnsi="Arial"/>
+                <w:b/>
+                <w:bCs/>
+                <w:color w:val="1a1917"/>
+                <w:sz w:val="18"/>
+                <w:szCs w:val="18"/>
+              </w:rPr>
+              <w:t xml:space="preserve"/>
+            </w:r>
+          </w:p>
+        </w:tc>
+        <w:tc>
+          <w:tcPr>
+            <w:tcBorders>
+              <w:top w:val="single" w:color="b8b5ae" w:sz="1"/>
+              <w:left w:val="single" w:color="b8b5ae" w:sz="1"/>
+              <w:bottom w:val="single" w:color="b8b5ae" w:sz="1"/>
+              <w:right w:val="single" w:color="b8b5ae" w:sz="1"/>
+            </w:tcBorders>
+            <w:vAlign w:val="center"/>
+          </w:tcPr>
+          <w:p>
+            <w:pPr>
+              <w:spacing w:after="40" w:before="40"/>
+              <w:jc w:val="center"/>
+            </w:pPr>
+            <w:r>
+              <w:rPr>
+                <w:rFonts w:ascii="Arial" w:cs="Arial" w:eastAsia="Arial" w:hAnsi="Arial"/>
+                <w:b w:val="false"/>
+                <w:bCs w:val="false"/>
+                <w:color w:val="1a1917"/>
+                <w:sz w:val="18"/>
+                <w:szCs w:val="18"/>
+              </w:rPr>
+              <w:t xml:space="preserve">–</w:t>
+            </w:r>
+          </w:p>
+        </w:tc>
+        <w:tc>
+          <w:tcPr>
+            <w:tcBorders>
+              <w:top w:val="single" w:color="b8b5ae" w:sz="1"/>
+              <w:left w:val="single" w:color="b8b5ae" w:sz="1"/>
+              <w:bottom w:val="single" w:color="b8b5ae" w:sz="1"/>
+              <w:right w:val="single" w:color="b8b5ae" w:sz="1"/>
+            </w:tcBorders>
+            <w:vAlign w:val="center"/>
+          </w:tcPr>
+          <w:p>
+            <w:pPr>
+              <w:spacing w:after="40" w:before="40"/>
+              <w:jc w:val="center"/>
+            </w:pPr>
+            <w:r>
+              <w:rPr>
+                <w:rFonts w:ascii="Arial" w:cs="Arial" w:eastAsia="Arial" w:hAnsi="Arial"/>
+                <w:b w:val="false"/>
+                <w:bCs w:val="false"/>
+                <w:color w:val="1a1917"/>
+                <w:sz w:val="18"/>
+                <w:szCs w:val="18"/>
+              </w:rPr>
+              <w:t xml:space="preserve">–</w:t>
+            </w:r>
+          </w:p>
+        </w:tc>
+        <w:tc>
+          <w:tcPr>
+            <w:tcBorders>
+              <w:top w:val="single" w:color="b8b5ae" w:sz="1"/>
+              <w:left w:val="single" w:color="b8b5ae" w:sz="1"/>
+              <w:bottom w:val="single" w:color="b8b5ae" w:sz="1"/>
+              <w:right w:val="single" w:color="b8b5ae" w:sz="1"/>
+            </w:tcBorders>
+            <w:vAlign w:val="center"/>
+          </w:tcPr>
+          <w:p>
+            <w:pPr>
+              <w:spacing w:after="40" w:before="40"/>
+              <w:jc w:val="center"/>
+            </w:pPr>
+            <w:r>
+              <w:rPr>
+                <w:rFonts w:ascii="Arial" w:cs="Arial" w:eastAsia="Arial" w:hAnsi="Arial"/>
+                <w:b w:val="false"/>
+                <w:bCs w:val="false"/>
+                <w:color w:val="1a1917"/>
+                <w:sz w:val="18"/>
+                <w:szCs w:val="18"/>
+              </w:rPr>
+              <w:t xml:space="preserve">–</w:t>
+            </w:r>
+          </w:p>
+        </w:tc>
+        <w:tc>
+          <w:tcPr>
+            <w:tcBorders>
+              <w:top w:val="single" w:color="b8b5ae" w:sz="1"/>
+              <w:left w:val="single" w:color="b8b5ae" w:sz="1"/>
+              <w:bottom w:val="single" w:color="b8b5ae" w:sz="1"/>
+              <w:right w:val="single" w:color="b8b5ae" w:sz="1"/>
+            </w:tcBorders>
+            <w:vAlign w:val="center"/>
+          </w:tcPr>
+          <w:p>
+            <w:pPr>
+              <w:spacing w:after="40" w:before="40"/>
+              <w:jc w:val="center"/>
+            </w:pPr>
+            <w:r>
+              <w:rPr>
+                <w:rFonts w:ascii="Arial" w:cs="Arial" w:eastAsia="Arial" w:hAnsi="Arial"/>
+                <w:b w:val="false"/>
+                <w:bCs w:val="false"/>
+                <w:color w:val="1a1917"/>
+                <w:sz w:val="18"/>
+                <w:szCs w:val="18"/>
+              </w:rPr>
+              <w:t xml:space="preserve">–</w:t>
+            </w:r>
+          </w:p>
+        </w:tc>
+        <w:tc>
+          <w:tcPr>
+            <w:tcBorders>
+              <w:top w:val="single" w:color="b8b5ae" w:sz="1"/>
+              <w:left w:val="single" w:color="b8b5ae" w:sz="1"/>
+              <w:bottom w:val="single" w:color="b8b5ae" w:sz="1"/>
+              <w:right w:val="single" w:color="b8b5ae" w:sz="1"/>
+            </w:tcBorders>
+            <w:vAlign w:val="center"/>
+          </w:tcPr>
+          <w:p>
+            <w:pPr>
+              <w:spacing w:after="40" w:before="40"/>
+              <w:jc w:val="center"/>
+            </w:pPr>
+            <w:r>
+              <w:rPr>
+                <w:rFonts w:ascii="Arial" w:cs="Arial" w:eastAsia="Arial" w:hAnsi="Arial"/>
+                <w:b w:val="false"/>
+                <w:bCs w:val="false"/>
+                <w:color w:val="1a1917"/>
+                <w:sz w:val="18"/>
+                <w:szCs w:val="18"/>
+              </w:rPr>
+              <w:t xml:space="preserve">A</w:t>
+            </w:r>
+          </w:p>
+        </w:tc>
+        <w:tc>
+          <w:tcPr>
+            <w:tcBorders>
+              <w:top w:val="single" w:color="b8b5ae" w:sz="1"/>
+              <w:left w:val="single" w:color="b8b5ae" w:sz="1"/>
+              <w:bottom w:val="single" w:color="b8b5ae" w:sz="1"/>
+              <w:right w:val="single" w:color="b8b5ae" w:sz="1"/>
+            </w:tcBorders>
+            <w:vAlign w:val="center"/>
+          </w:tcPr>
+          <w:p>
+            <w:pPr>
+              <w:spacing w:after="40" w:before="40"/>
+              <w:jc w:val="center"/>
+            </w:pPr>
+            <w:r>
+              <w:rPr>
+                <w:rFonts w:ascii="Arial" w:cs="Arial" w:eastAsia="Arial" w:hAnsi="Arial"/>
+                <w:b w:val="false"/>
+                <w:bCs w:val="false"/>
+                <w:color w:val="1a1917"/>
+                <w:sz w:val="18"/>
+                <w:szCs w:val="18"/>
+              </w:rPr>
+              <w:t xml:space="preserve">–</w:t>
+            </w:r>
+          </w:p>
+        </w:tc>
+      </w:tr>
+      <w:tr>
+        <w:tc>
+          <w:tcPr>
+            <w:tcBorders>
+              <w:top w:val="single" w:color="b8b5ae" w:sz="1"/>
+              <w:left w:val="single" w:color="b8b5ae" w:sz="1"/>
+              <w:bottom w:val="single" w:color="b8b5ae" w:sz="1"/>
+              <w:right w:val="single" w:color="b8b5ae" w:sz="1"/>
+            </w:tcBorders>
+            <w:vAlign w:val="center"/>
+          </w:tcPr>
+          <w:p>
+            <w:pPr>
+              <w:spacing w:after="40" w:before="40"/>
+              <w:jc w:val="left"/>
+            </w:pPr>
+            <w:r>
+              <w:rPr>
+                <w:rFonts w:ascii="Arial" w:cs="Arial" w:eastAsia="Arial" w:hAnsi="Arial"/>
+                <w:b/>
+                <w:bCs/>
+                <w:color w:val="1a1917"/>
+                <w:sz w:val="18"/>
+                <w:szCs w:val="18"/>
+              </w:rPr>
+              <w:t xml:space="preserve"/>
+            </w:r>
+          </w:p>
+        </w:tc>
+        <w:tc>
+          <w:tcPr>
+            <w:tcBorders>
+              <w:top w:val="single" w:color="b8b5ae" w:sz="1"/>
+              <w:left w:val="single" w:color="b8b5ae" w:sz="1"/>
+              <w:bottom w:val="single" w:color="b8b5ae" w:sz="1"/>
+              <w:right w:val="single" w:color="b8b5ae" w:sz="1"/>
+            </w:tcBorders>
+            <w:vAlign w:val="center"/>
+          </w:tcPr>
+          <w:p>
+            <w:pPr>
+              <w:spacing w:after="40" w:before="40"/>
+              <w:jc w:val="center"/>
+            </w:pPr>
+            <w:r>
+              <w:rPr>
+                <w:rFonts w:ascii="Arial" w:cs="Arial" w:eastAsia="Arial" w:hAnsi="Arial"/>
+                <w:b w:val="false"/>
+                <w:bCs w:val="false"/>
+                <w:color w:val="1a1917"/>
+                <w:sz w:val="18"/>
+                <w:szCs w:val="18"/>
+              </w:rPr>
+              <w:t xml:space="preserve">–</w:t>
+            </w:r>
+          </w:p>
+        </w:tc>
+        <w:tc>
+          <w:tcPr>
+            <w:tcBorders>
+              <w:top w:val="single" w:color="b8b5ae" w:sz="1"/>
+              <w:left w:val="single" w:color="b8b5ae" w:sz="1"/>
+              <w:bottom w:val="single" w:color="b8b5ae" w:sz="1"/>
+              <w:right w:val="single" w:color="b8b5ae" w:sz="1"/>
+            </w:tcBorders>
+            <w:vAlign w:val="center"/>
+          </w:tcPr>
+          <w:p>
+            <w:pPr>
+              <w:spacing w:after="40" w:before="40"/>
+              <w:jc w:val="center"/>
+            </w:pPr>
+            <w:r>
+              <w:rPr>
+                <w:rFonts w:ascii="Arial" w:cs="Arial" w:eastAsia="Arial" w:hAnsi="Arial"/>
+                <w:b w:val="false"/>
+                <w:bCs w:val="false"/>
+                <w:color w:val="1a1917"/>
+                <w:sz w:val="18"/>
+                <w:szCs w:val="18"/>
+              </w:rPr>
+              <w:t xml:space="preserve">–</w:t>
+            </w:r>
+          </w:p>
+        </w:tc>
+        <w:tc>
+          <w:tcPr>
+            <w:tcBorders>
+              <w:top w:val="single" w:color="b8b5ae" w:sz="1"/>
+              <w:left w:val="single" w:color="b8b5ae" w:sz="1"/>
+              <w:bottom w:val="single" w:color="b8b5ae" w:sz="1"/>
+              <w:right w:val="single" w:color="b8b5ae" w:sz="1"/>
+            </w:tcBorders>
+            <w:vAlign w:val="center"/>
+          </w:tcPr>
+          <w:p>
+            <w:pPr>
+              <w:spacing w:after="40" w:before="40"/>
+              <w:jc w:val="center"/>
+            </w:pPr>
+            <w:r>
+              <w:rPr>
+                <w:rFonts w:ascii="Arial" w:cs="Arial" w:eastAsia="Arial" w:hAnsi="Arial"/>
+                <w:b w:val="false"/>
+                <w:bCs w:val="false"/>
+                <w:color w:val="1a1917"/>
+                <w:sz w:val="18"/>
+                <w:szCs w:val="18"/>
+              </w:rPr>
+              <w:t xml:space="preserve">–</w:t>
+            </w:r>
+          </w:p>
+        </w:tc>
+        <w:tc>
+          <w:tcPr>
+            <w:tcBorders>
+              <w:top w:val="single" w:color="b8b5ae" w:sz="1"/>
+              <w:left w:val="single" w:color="b8b5ae" w:sz="1"/>
+              <w:bottom w:val="single" w:color="b8b5ae" w:sz="1"/>
+              <w:right w:val="single" w:color="b8b5ae" w:sz="1"/>
+            </w:tcBorders>
+            <w:vAlign w:val="center"/>
+          </w:tcPr>
+          <w:p>
+            <w:pPr>
+              <w:spacing w:after="40" w:before="40"/>
+              <w:jc w:val="center"/>
+            </w:pPr>
+            <w:r>
+              <w:rPr>
+                <w:rFonts w:ascii="Arial" w:cs="Arial" w:eastAsia="Arial" w:hAnsi="Arial"/>
+                <w:b w:val="false"/>
+                <w:bCs w:val="false"/>
+                <w:color w:val="1a1917"/>
+                <w:sz w:val="18"/>
+                <w:szCs w:val="18"/>
+              </w:rPr>
+              <w:t xml:space="preserve">–</w:t>
+            </w:r>
+          </w:p>
+        </w:tc>
+        <w:tc>
+          <w:tcPr>
+            <w:tcBorders>
+              <w:top w:val="single" w:color="b8b5ae" w:sz="1"/>
+              <w:left w:val="single" w:color="b8b5ae" w:sz="1"/>
+              <w:bottom w:val="single" w:color="b8b5ae" w:sz="1"/>
+              <w:right w:val="single" w:color="b8b5ae" w:sz="1"/>
+            </w:tcBorders>
+            <w:vAlign w:val="center"/>
+          </w:tcPr>
+          <w:p>
+            <w:pPr>
+              <w:spacing w:after="40" w:before="40"/>
+              <w:jc w:val="center"/>
+            </w:pPr>
+            <w:r>
+              <w:rPr>
+                <w:rFonts w:ascii="Arial" w:cs="Arial" w:eastAsia="Arial" w:hAnsi="Arial"/>
+                <w:b w:val="false"/>
+                <w:bCs w:val="false"/>
+                <w:color w:val="1a1917"/>
+                <w:sz w:val="18"/>
+                <w:szCs w:val="18"/>
+              </w:rPr>
+              <w:t xml:space="preserve">A</w:t>
+            </w:r>
+          </w:p>
+        </w:tc>
+        <w:tc>
+          <w:tcPr>
+            <w:tcBorders>
+              <w:top w:val="single" w:color="b8b5ae" w:sz="1"/>
+              <w:left w:val="single" w:color="b8b5ae" w:sz="1"/>
+              <w:bottom w:val="single" w:color="b8b5ae" w:sz="1"/>
+              <w:right w:val="single" w:color="b8b5ae" w:sz="1"/>
+            </w:tcBorders>
+            <w:vAlign w:val="center"/>
+          </w:tcPr>
+          <w:p>
+            <w:pPr>
+              <w:spacing w:after="40" w:before="40"/>
+              <w:jc w:val="center"/>
+            </w:pPr>
+            <w:r>
+              <w:rPr>
+                <w:rFonts w:ascii="Arial" w:cs="Arial" w:eastAsia="Arial" w:hAnsi="Arial"/>
+                <w:b w:val="false"/>
+                <w:bCs w:val="false"/>
+                <w:color w:val="1a1917"/>
+                <w:sz w:val="18"/>
+                <w:szCs w:val="18"/>
+              </w:rPr>
+              <w:t xml:space="preserve">–</w:t>
             </w:r>
           </w:p>
         </w:tc>

</xml_diff>